<commit_message>
Number the introductions of chapters 1 and 4 and align section references
- Chapters 1 and 4: the "مقدمه" headings carry their numbers (1-1 and 4-1)
  again; the section numbers in the introductory paragraphs are removed.
- Chapter 1: sections renumbered after the introduction (1-2 to 1-7).
- Chapter 4: sections renumbered (4-2 to 4-7) and cross-references updated;
  the first round states that the coded statements were combined and reviewed
  into 29 items in nine components before they were sent to the panel.
- Chapter 2: place of each study stated where the paragraph did not name it.
- Chapter 5: references to the problem statement point to section 1-2.

Claude-Session: https://claude.ai/code/session_012d4zYSXkv12fA3MhDxMQzc
</commit_message>
<xml_diff>
--- a/chapter1_revised.docx
+++ b/chapter1_revised.docx
@@ -58,7 +58,7 @@
           <w:sz w:val="32"/>
           <w:szCs w:val="32"/>
         </w:rPr>
-        <w:t xml:space="preserve">مقدمه</w:t>
+        <w:t xml:space="preserve">۱-۱ مقدمه</w:t>
       </w:r>
     </w:p>
     <w:p>
@@ -98,7 +98,7 @@
         <w:rPr>
           <w:rtl/>
         </w:rPr>
-        <w:t xml:space="preserve">سرتیترهای این فصل به ترتیب عبارت‌اند از: بیان مسئله (۱-۱)، اهمیت و ضرورت پژوهش (۱-۲)، اهداف پژوهش (۱-۳)، پرسش‌های پژوهش (۱-۴)، قلمروهای پژوهش (۱-۵) و تعاریف مفهومی و عملیاتی (۱-۶).</w:t>
+        <w:t xml:space="preserve">سرتیترهای این فصل به ترتیب عبارت‌اند از: بیان مسئله، اهمیت و ضرورت پژوهش، اهداف پژوهش، پرسش‌های پژوهش، قلمروهای پژوهش و تعاریف مفهومی و عملیاتی.</w:t>
       </w:r>
     </w:p>
     <w:p>
@@ -117,7 +117,7 @@
           <w:sz w:val="32"/>
           <w:szCs w:val="32"/>
         </w:rPr>
-        <w:t xml:space="preserve">۱-۱ بیان مسئله</w:t>
+        <w:t xml:space="preserve">۱-۲ بیان مسئله</w:t>
       </w:r>
     </w:p>
     <w:p>
@@ -464,7 +464,7 @@
           <w:sz w:val="32"/>
           <w:szCs w:val="32"/>
         </w:rPr>
-        <w:t xml:space="preserve">۱-۲ اهمیت و ضرورت</w:t>
+        <w:t xml:space="preserve">۱-۳ اهمیت و ضرورت</w:t>
       </w:r>
     </w:p>
     <w:p>
@@ -674,7 +674,7 @@
           <w:sz w:val="32"/>
           <w:szCs w:val="32"/>
         </w:rPr>
-        <w:t xml:space="preserve">۱-۳ اهداف تحقیق</w:t>
+        <w:t xml:space="preserve">۱-۴ اهداف تحقیق</w:t>
       </w:r>
     </w:p>
     <w:p>
@@ -735,7 +735,7 @@
           <w:sz w:val="32"/>
           <w:szCs w:val="32"/>
         </w:rPr>
-        <w:t xml:space="preserve">۱-۴ پرسش‌های تحقیق</w:t>
+        <w:t xml:space="preserve">۱-۵ پرسش‌های تحقیق</w:t>
       </w:r>
     </w:p>
     <w:p>
@@ -790,7 +790,7 @@
           <w:sz w:val="32"/>
           <w:szCs w:val="32"/>
         </w:rPr>
-        <w:t xml:space="preserve">۱-۵ قلمروهای تحقیق</w:t>
+        <w:t xml:space="preserve">۱-۶ قلمروهای تحقیق</w:t>
       </w:r>
     </w:p>
     <w:p>
@@ -801,7 +801,7 @@
         <w:spacing w:before="180" w:after="80"/>
       </w:pPr>
       <w:r>
-        <w:t xml:space="preserve">۱-۵-۱ قلمرو موضوعی</w:t>
+        <w:t xml:space="preserve">۱-۶-۱ قلمرو موضوعی</w:t>
       </w:r>
     </w:p>
     <w:p>
@@ -826,7 +826,7 @@
         <w:spacing w:before="180" w:after="80"/>
       </w:pPr>
       <w:r>
-        <w:t xml:space="preserve">۱-۵-۲ قلمرو مکانی</w:t>
+        <w:t xml:space="preserve">۱-۶-۲ قلمرو مکانی</w:t>
       </w:r>
     </w:p>
     <w:p>
@@ -851,7 +851,7 @@
         <w:spacing w:before="180" w:after="80"/>
       </w:pPr>
       <w:r>
-        <w:t xml:space="preserve">۱-۵-۳ قلمرو زمانی</w:t>
+        <w:t xml:space="preserve">۱-۶-۳ قلمرو زمانی</w:t>
       </w:r>
     </w:p>
     <w:p>
@@ -884,7 +884,7 @@
           <w:sz w:val="32"/>
           <w:szCs w:val="32"/>
         </w:rPr>
-        <w:t xml:space="preserve">۱-۶ تعاریف مفهومی و عملیاتی</w:t>
+        <w:t xml:space="preserve">۱-۷ تعاریف مفهومی و عملیاتی</w:t>
       </w:r>
     </w:p>
     <w:p>
@@ -895,7 +895,7 @@
         <w:spacing w:before="180" w:after="80"/>
       </w:pPr>
       <w:r>
-        <w:t xml:space="preserve">۱-۶-۱ فروش</w:t>
+        <w:t xml:space="preserve">۱-۷-۱ فروش</w:t>
       </w:r>
     </w:p>
     <w:p>
@@ -932,7 +932,7 @@
         <w:spacing w:before="180" w:after="80"/>
       </w:pPr>
       <w:r>
-        <w:t xml:space="preserve">۱-۶-۲ شرکت تک‌محصولی</w:t>
+        <w:t xml:space="preserve">۱-۷-۲ شرکت تک‌محصولی</w:t>
       </w:r>
     </w:p>
     <w:p>

</xml_diff>